<commit_message>
Signigficant formatting updates for html and word vignette files
</commit_message>
<xml_diff>
--- a/vignettes/word_formatted/template.docx
+++ b/vignettes/word_formatted/template.docx
@@ -1235,7 +1235,7 @@
   <w:abstractNum w:abstractNumId="1" w15:restartNumberingAfterBreak="0">
     <w:nsid w:val="FFFFFF7C"/>
     <w:multiLevelType w:val="singleLevel"/>
-    <w:tmpl w:val="31FCF1BE"/>
+    <w:tmpl w:val="05A26D58"/>
     <w:lvl w:ilvl="0">
       <w:start w:val="1"/>
       <w:numFmt w:val="decimal"/>
@@ -1252,7 +1252,7 @@
   <w:abstractNum w:abstractNumId="2" w15:restartNumberingAfterBreak="0">
     <w:nsid w:val="FFFFFF7D"/>
     <w:multiLevelType w:val="singleLevel"/>
-    <w:tmpl w:val="E8628C34"/>
+    <w:tmpl w:val="18BC22DE"/>
     <w:lvl w:ilvl="0">
       <w:start w:val="1"/>
       <w:numFmt w:val="decimal"/>
@@ -1269,7 +1269,7 @@
   <w:abstractNum w:abstractNumId="3" w15:restartNumberingAfterBreak="0">
     <w:nsid w:val="FFFFFF7E"/>
     <w:multiLevelType w:val="singleLevel"/>
-    <w:tmpl w:val="8E12DC16"/>
+    <w:tmpl w:val="663CA652"/>
     <w:lvl w:ilvl="0">
       <w:start w:val="1"/>
       <w:numFmt w:val="decimal"/>
@@ -1286,7 +1286,7 @@
   <w:abstractNum w:abstractNumId="4" w15:restartNumberingAfterBreak="0">
     <w:nsid w:val="FFFFFF7F"/>
     <w:multiLevelType w:val="singleLevel"/>
-    <w:tmpl w:val="CE96FF7A"/>
+    <w:tmpl w:val="9BB2700E"/>
     <w:lvl w:ilvl="0">
       <w:start w:val="1"/>
       <w:numFmt w:val="decimal"/>
@@ -1303,7 +1303,7 @@
   <w:abstractNum w:abstractNumId="5" w15:restartNumberingAfterBreak="0">
     <w:nsid w:val="FFFFFF80"/>
     <w:multiLevelType w:val="singleLevel"/>
-    <w:tmpl w:val="4842996C"/>
+    <w:tmpl w:val="DE96ADD6"/>
     <w:lvl w:ilvl="0">
       <w:start w:val="1"/>
       <w:numFmt w:val="bullet"/>
@@ -1323,7 +1323,7 @@
   <w:abstractNum w:abstractNumId="6" w15:restartNumberingAfterBreak="0">
     <w:nsid w:val="FFFFFF81"/>
     <w:multiLevelType w:val="singleLevel"/>
-    <w:tmpl w:val="EEB07E7E"/>
+    <w:tmpl w:val="F634EF16"/>
     <w:lvl w:ilvl="0">
       <w:start w:val="1"/>
       <w:numFmt w:val="bullet"/>
@@ -1343,7 +1343,7 @@
   <w:abstractNum w:abstractNumId="7" w15:restartNumberingAfterBreak="0">
     <w:nsid w:val="FFFFFF82"/>
     <w:multiLevelType w:val="singleLevel"/>
-    <w:tmpl w:val="DCAAE2F2"/>
+    <w:tmpl w:val="41C8298A"/>
     <w:lvl w:ilvl="0">
       <w:start w:val="1"/>
       <w:numFmt w:val="bullet"/>
@@ -1363,7 +1363,7 @@
   <w:abstractNum w:abstractNumId="8" w15:restartNumberingAfterBreak="0">
     <w:nsid w:val="FFFFFF83"/>
     <w:multiLevelType w:val="singleLevel"/>
-    <w:tmpl w:val="58D097F4"/>
+    <w:tmpl w:val="DCF65D72"/>
     <w:lvl w:ilvl="0">
       <w:start w:val="1"/>
       <w:numFmt w:val="bullet"/>
@@ -1383,7 +1383,7 @@
   <w:abstractNum w:abstractNumId="9" w15:restartNumberingAfterBreak="0">
     <w:nsid w:val="FFFFFF88"/>
     <w:multiLevelType w:val="singleLevel"/>
-    <w:tmpl w:val="489046D6"/>
+    <w:tmpl w:val="62BE6AF4"/>
     <w:lvl w:ilvl="0">
       <w:start w:val="1"/>
       <w:numFmt w:val="decimal"/>
@@ -1400,7 +1400,7 @@
   <w:abstractNum w:abstractNumId="10" w15:restartNumberingAfterBreak="0">
     <w:nsid w:val="FFFFFF89"/>
     <w:multiLevelType w:val="singleLevel"/>
-    <w:tmpl w:val="A412F024"/>
+    <w:tmpl w:val="74602640"/>
     <w:lvl w:ilvl="0">
       <w:start w:val="1"/>
       <w:numFmt w:val="bullet"/>
@@ -2270,9 +2270,9 @@
     <w:basedOn w:val="Normal"/>
     <w:link w:val="BodyTextChar"/>
     <w:qFormat/>
-    <w:rsid w:val="00527610"/>
+    <w:rsid w:val="005C21B0"/>
     <w:pPr>
-      <w:spacing w:before="180" w:after="180"/>
+      <w:spacing w:after="180"/>
     </w:pPr>
   </w:style>
   <w:style w:type="paragraph" w:customStyle="1" w:styleId="FirstParagraph">
@@ -2280,7 +2280,10 @@
     <w:basedOn w:val="BodyText"/>
     <w:next w:val="BodyText"/>
     <w:qFormat/>
-    <w:rsid w:val="00731E1B"/>
+    <w:rsid w:val="00E546F2"/>
+    <w:pPr>
+      <w:spacing w:before="180"/>
+    </w:pPr>
   </w:style>
   <w:style w:type="paragraph" w:customStyle="1" w:styleId="Compact">
     <w:name w:val="Compact"/>
@@ -2887,7 +2890,7 @@
     <w:name w:val="Body Text Char"/>
     <w:basedOn w:val="DefaultParagraphFont"/>
     <w:link w:val="BodyText"/>
-    <w:rsid w:val="00527610"/>
+    <w:rsid w:val="005C21B0"/>
   </w:style>
   <w:style w:type="paragraph" w:styleId="Header">
     <w:name w:val="header"/>

</xml_diff>